<commit_message>
Ingest CACI IR primary sources: 10-K FY25, 10-Q Q3 FY26, ARKA + Azure Summit 8-Ks, Q3 FY26 earnings transcript
</commit_message>
<xml_diff>
--- a/opportunities/PMTEC-USINDOPACOM/04_artifacts/capture-brief-v0.1-draft.docx
+++ b/opportunities/PMTEC-USINDOPACOM/04_artifacts/capture-brief-v0.1-draft.docx
@@ -4134,7 +4134,7 @@
           <w:i/>
           <w:sz w:val="20"/>
         </w:rPr>
-        <w:t>All primary and secondary sources captured into this opportunity's 01_sources/ folder (17 total). Each entry is hyperlinked to the live source URL. Re-generate via _scripts/refresh_brief_sources.py.</w:t>
+        <w:t>All primary and secondary sources captured into this opportunity's 01_sources/ folder (22 total). Each entry is hyperlinked to the live source URL. Re-generate via _scripts/refresh_brief_sources.py.</w:t>
       </w:r>
     </w:p>
     <w:p>
@@ -4592,6 +4592,43 @@
         <w:rPr>
           <w:b/>
         </w:rPr>
+        <w:t>CACI Q3 FY2026 Earnings Call Transcript (April 23, 2026) — Motley Fool</w:t>
+      </w:r>
+      <w:r>
+        <w:br/>
+        <w:t xml:space="preserve">   </w:t>
+      </w:r>
+      <w:hyperlink r:id="rId27">
+        <w:r>
+          <w:rPr>
+            <w:color w:val="0563C1"/>
+            <w:u w:val="single"/>
+          </w:rPr>
+          <w:t xml:space="preserve">https://www.fool.com/earnings/call-transcripts/2026/04/23/caci-caci-q3-2026-earnings-call-transcript/</w:t>
+        </w:r>
+      </w:hyperlink>
+    </w:p>
+    <w:p>
+      <w:r>
+        <w:rPr>
+          <w:i/>
+          <w:color w:val="555555"/>
+          <w:sz w:val="18"/>
+        </w:rPr>
+        <w:t xml:space="preserve">   Publisher: fool-com   ·   Tier 4   ·   Captured: 2026-05-12   ·   Pub: 2026-04-23   ·   Local: 01_sources/2026-05-12_fool-com_caci-q3-fy2026-earnings-call-transcript-april-23-2026-motley.md</w:t>
+      </w:r>
+    </w:p>
+    <w:p>
+      <w:r>
+        <w:rPr>
+          <w:b/>
+        </w:rPr>
+        <w:t xml:space="preserve">14. </w:t>
+      </w:r>
+      <w:r>
+        <w:rPr>
+          <w:b/>
+        </w:rPr>
         <w:t>CACI Completes Acquisition of ARKA Group ($2.6B, close 2026-03-09)</w:t>
       </w:r>
       <w:r>
@@ -4623,7 +4660,7 @@
         <w:rPr>
           <w:b/>
         </w:rPr>
-        <w:t xml:space="preserve">14. </w:t>
+        <w:t xml:space="preserve">15. </w:t>
       </w:r>
       <w:r>
         <w:rPr>
@@ -4660,7 +4697,7 @@
         <w:rPr>
           <w:b/>
         </w:rPr>
-        <w:t xml:space="preserve">15. </w:t>
+        <w:t xml:space="preserve">16. </w:t>
       </w:r>
       <w:r>
         <w:rPr>
@@ -4697,7 +4734,7 @@
         <w:rPr>
           <w:b/>
         </w:rPr>
-        <w:t xml:space="preserve">16. </w:t>
+        <w:t xml:space="preserve">17. </w:t>
       </w:r>
       <w:r>
         <w:rPr>
@@ -4734,7 +4771,155 @@
         <w:rPr>
           <w:b/>
         </w:rPr>
-        <w:t xml:space="preserve">17. </w:t>
+        <w:t xml:space="preserve">18. </w:t>
+      </w:r>
+      <w:r>
+        <w:rPr>
+          <w:b/>
+        </w:rPr>
+        <w:t>CACI 8-K — Definitive Agreement to Acquire ARKA Group (Dec 22, 2025, $2.6B)</w:t>
+      </w:r>
+      <w:r>
+        <w:br/>
+        <w:t xml:space="preserve">   </w:t>
+      </w:r>
+      <w:hyperlink r:id="rId28">
+        <w:r>
+          <w:rPr>
+            <w:color w:val="0563C1"/>
+            <w:u w:val="single"/>
+          </w:rPr>
+          <w:t xml:space="preserve">https://www.sec.gov/Archives/edgar/data/16058/000162828025059047/caci-20251219.htm</w:t>
+        </w:r>
+      </w:hyperlink>
+    </w:p>
+    <w:p>
+      <w:r>
+        <w:rPr>
+          <w:i/>
+          <w:color w:val="555555"/>
+          <w:sz w:val="18"/>
+        </w:rPr>
+        <w:t xml:space="preserve">   Publisher: sec-gov   ·   Tier 2   ·   Captured: 2026-05-12   ·   Local: 01_sources/2026-05-12_sec-gov_caci-8-k-definitive-agreement-to-acquire-arka-group-dec-22-2.md</w:t>
+      </w:r>
+    </w:p>
+    <w:p>
+      <w:r>
+        <w:rPr>
+          <w:b/>
+        </w:rPr>
+        <w:t xml:space="preserve">19. </w:t>
+      </w:r>
+      <w:r>
+        <w:rPr>
+          <w:b/>
+        </w:rPr>
+        <w:t>CACI 8-K — Definitive Agreement to Acquire Azure Summit Technology (Sep 10, 2024, $1.275B)</w:t>
+      </w:r>
+      <w:r>
+        <w:br/>
+        <w:t xml:space="preserve">   </w:t>
+      </w:r>
+      <w:hyperlink r:id="rId29">
+        <w:r>
+          <w:rPr>
+            <w:color w:val="0563C1"/>
+            <w:u w:val="single"/>
+          </w:rPr>
+          <w:t xml:space="preserve">https://www.sec.gov/Archives/edgar/data/16058/000001605824000148/caci-20240910.htm</w:t>
+        </w:r>
+      </w:hyperlink>
+    </w:p>
+    <w:p>
+      <w:r>
+        <w:rPr>
+          <w:i/>
+          <w:color w:val="555555"/>
+          <w:sz w:val="18"/>
+        </w:rPr>
+        <w:t xml:space="preserve">   Publisher: sec-gov   ·   Tier 2   ·   Captured: 2026-05-12   ·   Local: 01_sources/2026-05-12_sec-gov_caci-8-k-definitive-agreement-to-acquire-azure-summit-techno.md</w:t>
+      </w:r>
+    </w:p>
+    <w:p>
+      <w:r>
+        <w:rPr>
+          <w:b/>
+        </w:rPr>
+        <w:t xml:space="preserve">20. </w:t>
+      </w:r>
+      <w:r>
+        <w:rPr>
+          <w:b/>
+        </w:rPr>
+        <w:t>CACI International Form 10-K — Fiscal Year Ended June 30, 2025</w:t>
+      </w:r>
+      <w:r>
+        <w:br/>
+        <w:t xml:space="preserve">   </w:t>
+      </w:r>
+      <w:hyperlink r:id="rId30">
+        <w:r>
+          <w:rPr>
+            <w:color w:val="0563C1"/>
+            <w:u w:val="single"/>
+          </w:rPr>
+          <w:t xml:space="preserve">https://www.sec.gov/Archives/edgar/data/16058/000162828025038739/caci-20250630.htm</w:t>
+        </w:r>
+      </w:hyperlink>
+    </w:p>
+    <w:p>
+      <w:r>
+        <w:rPr>
+          <w:i/>
+          <w:color w:val="555555"/>
+          <w:sz w:val="18"/>
+        </w:rPr>
+        <w:t xml:space="preserve">   Publisher: sec-gov   ·   Tier 2   ·   Captured: 2026-05-12   ·   Local: 01_sources/2026-05-12_sec-gov_caci-international-form-10-k-fiscal-year-ended-june-30-2025.md</w:t>
+      </w:r>
+    </w:p>
+    <w:p>
+      <w:r>
+        <w:rPr>
+          <w:b/>
+        </w:rPr>
+        <w:t xml:space="preserve">21. </w:t>
+      </w:r>
+      <w:r>
+        <w:rPr>
+          <w:b/>
+        </w:rPr>
+        <w:t>CACI International Form 10-Q — Quarterly Report for Q3 FY2026 (period ended March 31, 2026)</w:t>
+      </w:r>
+      <w:r>
+        <w:br/>
+        <w:t xml:space="preserve">   </w:t>
+      </w:r>
+      <w:hyperlink r:id="rId31">
+        <w:r>
+          <w:rPr>
+            <w:color w:val="0563C1"/>
+            <w:u w:val="single"/>
+          </w:rPr>
+          <w:t xml:space="preserve">https://www.sec.gov/Archives/edgar/data/16058/000162828026026802/caci-20260331.htm</w:t>
+        </w:r>
+      </w:hyperlink>
+    </w:p>
+    <w:p>
+      <w:r>
+        <w:rPr>
+          <w:i/>
+          <w:color w:val="555555"/>
+          <w:sz w:val="18"/>
+        </w:rPr>
+        <w:t xml:space="preserve">   Publisher: sec-gov   ·   Tier 2   ·   Captured: 2026-05-12   ·   Local: 01_sources/2026-05-12_sec-gov_caci-international-form-10-q-quarterly-report-for-q3-fy2026.md</w:t>
+      </w:r>
+    </w:p>
+    <w:p>
+      <w:r>
+        <w:rPr>
+          <w:b/>
+        </w:rPr>
+        <w:t xml:space="preserve">22. </w:t>
       </w:r>
       <w:r>
         <w:rPr>

</xml_diff>

<commit_message>
Add competitive landscape primary sources (12 new): HII 10-K, SOSi IMN, Lockheed JFN+Indo-Pac, L3Harris DiSCO+autonomous EW, Northrop Indo-Pac+Japan EW, RTX NGJ+ADVEW, APL PMTEC AI. New §5.3 with 7 vault-grounded competitor FACTs.
</commit_message>
<xml_diff>
--- a/opportunities/PMTEC-USINDOPACOM/04_artifacts/capture-brief-v0.1-draft.docx
+++ b/opportunities/PMTEC-USINDOPACOM/04_artifacts/capture-brief-v0.1-draft.docx
@@ -4134,7 +4134,7 @@
           <w:i/>
           <w:sz w:val="20"/>
         </w:rPr>
-        <w:t>All primary and secondary sources captured into this opportunity's 01_sources/ folder (22 total). Each entry is hyperlinked to the live source URL. Re-generate via _scripts/refresh_brief_sources.py.</w:t>
+        <w:t>All primary and secondary sources captured into this opportunity's 01_sources/ folder (34 total). Each entry is hyperlinked to the live source URL. Re-generate via _scripts/refresh_brief_sources.py.</w:t>
       </w:r>
     </w:p>
     <w:p>
@@ -4555,6 +4555,43 @@
         <w:rPr>
           <w:b/>
         </w:rPr>
+        <w:t>INDOPACOM is replacing a pile of partner-nation networks with just one (Defense One, Nov 2024 — SOSi IMN context)</w:t>
+      </w:r>
+      <w:r>
+        <w:br/>
+        <w:t xml:space="preserve">   </w:t>
+      </w:r>
+      <w:hyperlink r:id="rId32">
+        <w:r>
+          <w:rPr>
+            <w:color w:val="0563C1"/>
+            <w:u w:val="single"/>
+          </w:rPr>
+          <w:t xml:space="preserve">https://www.defenseone.com/defense-systems/2024/11/indopacom-replacing-pile-partner-nation-networks-just-one/401129/</w:t>
+        </w:r>
+      </w:hyperlink>
+    </w:p>
+    <w:p>
+      <w:r>
+        <w:rPr>
+          <w:i/>
+          <w:color w:val="555555"/>
+          <w:sz w:val="18"/>
+        </w:rPr>
+        <w:t xml:space="preserve">   Publisher: defenseone-com   ·   Tier 4   ·   Captured: 2026-05-12   ·   Pub: 2024-11-18   ·   Local: 01_sources/2026-05-12_defenseone-com_indopacom-is-replacing-a-pile-of-partner-nation-networks-wit.md</w:t>
+      </w:r>
+    </w:p>
+    <w:p>
+      <w:r>
+        <w:rPr>
+          <w:b/>
+        </w:rPr>
+        <w:t xml:space="preserve">13. </w:t>
+      </w:r>
+      <w:r>
+        <w:rPr>
+          <w:b/>
+        </w:rPr>
         <w:t>DVIDS - News - Rivalries During the Season, Teammates for a Reason</w:t>
       </w:r>
       <w:r>
@@ -4586,7 +4623,7 @@
         <w:rPr>
           <w:b/>
         </w:rPr>
-        <w:t xml:space="preserve">13. </w:t>
+        <w:t xml:space="preserve">14. </w:t>
       </w:r>
       <w:r>
         <w:rPr>
@@ -4623,7 +4660,155 @@
         <w:rPr>
           <w:b/>
         </w:rPr>
-        <w:t xml:space="preserve">14. </w:t>
+        <w:t xml:space="preserve">15. </w:t>
+      </w:r>
+      <w:r>
+        <w:rPr>
+          <w:b/>
+        </w:rPr>
+        <w:t>PMTEC pioneers AI-enabled warfare capabilities (Indo-Pacific Defense FORUM, Jan 2026)</w:t>
+      </w:r>
+      <w:r>
+        <w:br/>
+        <w:t xml:space="preserve">   </w:t>
+      </w:r>
+      <w:hyperlink r:id="rId33">
+        <w:r>
+          <w:rPr>
+            <w:color w:val="0563C1"/>
+            <w:u w:val="single"/>
+          </w:rPr>
+          <w:t xml:space="preserve">https://ipdefenseforum.com/2026/01/pmtec-pioneers-ai-enabled-warfare-capabilities/</w:t>
+        </w:r>
+      </w:hyperlink>
+    </w:p>
+    <w:p>
+      <w:r>
+        <w:rPr>
+          <w:i/>
+          <w:color w:val="555555"/>
+          <w:sz w:val="18"/>
+        </w:rPr>
+        <w:t xml:space="preserve">   Publisher: ipdefenseforum-com   ·   Tier 4   ·   Captured: 2026-05-12   ·   Local: 01_sources/2026-05-12_ipdefenseforum-com_pmtec-pioneers-ai-enabled-warfare-capabilities-indo-pacific.md</w:t>
+      </w:r>
+    </w:p>
+    <w:p>
+      <w:r>
+        <w:rPr>
+          <w:b/>
+        </w:rPr>
+        <w:t xml:space="preserve">16. </w:t>
+      </w:r>
+      <w:r>
+        <w:rPr>
+          <w:b/>
+        </w:rPr>
+        <w:t>L3Harris Demonstrates Autonomous EW Capability with Shield AI (April 2026)</w:t>
+      </w:r>
+      <w:r>
+        <w:br/>
+        <w:t xml:space="preserve">   </w:t>
+      </w:r>
+      <w:hyperlink r:id="rId34">
+        <w:r>
+          <w:rPr>
+            <w:color w:val="0563C1"/>
+            <w:u w:val="single"/>
+          </w:rPr>
+          <w:t xml:space="preserve">https://www.l3harris.com/newsroom/press-release/2026/04/l3harris-demonstrates-autonomous-electronic-warfare-capability</w:t>
+        </w:r>
+      </w:hyperlink>
+    </w:p>
+    <w:p>
+      <w:r>
+        <w:rPr>
+          <w:i/>
+          <w:color w:val="555555"/>
+          <w:sz w:val="18"/>
+        </w:rPr>
+        <w:t xml:space="preserve">   Publisher: l3harris-com   ·   Tier 4   ·   Captured: 2026-05-12   ·   Local: 01_sources/2026-05-12_l3harris-com_l3harris-demonstrates-autonomous-ew-capability-with-shield-a.md</w:t>
+      </w:r>
+    </w:p>
+    <w:p>
+      <w:r>
+        <w:rPr>
+          <w:b/>
+        </w:rPr>
+        <w:t xml:space="preserve">17. </w:t>
+      </w:r>
+      <w:r>
+        <w:rPr>
+          <w:b/>
+        </w:rPr>
+        <w:t>L3Harris Demonstrates DiSCO Electronic Warfare Operations During Valiant Shield 2024</w:t>
+      </w:r>
+      <w:r>
+        <w:br/>
+        <w:t xml:space="preserve">   </w:t>
+      </w:r>
+      <w:hyperlink r:id="rId35">
+        <w:r>
+          <w:rPr>
+            <w:color w:val="0563C1"/>
+            <w:u w:val="single"/>
+          </w:rPr>
+          <w:t xml:space="preserve">https://www.l3harris.com/newsroom/press-release/2024/07/l3harris-demonstrates-electronic-warfare-valiant-shield-2024</w:t>
+        </w:r>
+      </w:hyperlink>
+    </w:p>
+    <w:p>
+      <w:r>
+        <w:rPr>
+          <w:i/>
+          <w:color w:val="555555"/>
+          <w:sz w:val="18"/>
+        </w:rPr>
+        <w:t xml:space="preserve">   Publisher: l3harris-com   ·   Tier 4   ·   Captured: 2026-05-12   ·   Local: 01_sources/2026-05-12_l3harris-com_l3harris-demonstrates-disco-electronic-warfare-operations-du.md</w:t>
+      </w:r>
+    </w:p>
+    <w:p>
+      <w:r>
+        <w:rPr>
+          <w:b/>
+        </w:rPr>
+        <w:t xml:space="preserve">18. </w:t>
+      </w:r>
+      <w:r>
+        <w:rPr>
+          <w:b/>
+        </w:rPr>
+        <w:t>Lockheed Martin — All In in the Indo-Pacific (feature, 2024)</w:t>
+      </w:r>
+      <w:r>
+        <w:br/>
+        <w:t xml:space="preserve">   </w:t>
+      </w:r>
+      <w:hyperlink r:id="rId36">
+        <w:r>
+          <w:rPr>
+            <w:color w:val="0563C1"/>
+            <w:u w:val="single"/>
+          </w:rPr>
+          <w:t xml:space="preserve">https://www.lockheedmartin.com/en-us/news/features/2024/lockheed-martin-all-in-in-the-Indo-Pacific.html</w:t>
+        </w:r>
+      </w:hyperlink>
+    </w:p>
+    <w:p>
+      <w:r>
+        <w:rPr>
+          <w:i/>
+          <w:color w:val="555555"/>
+          <w:sz w:val="18"/>
+        </w:rPr>
+        <w:t xml:space="preserve">   Publisher: lockheedmartin-com   ·   Tier 4   ·   Captured: 2026-05-12   ·   Local: 01_sources/2026-05-12_lockheedmartin-com_lockheed-martin-all-in-in-the-indo-pacific-feature-2024.md</w:t>
+      </w:r>
+    </w:p>
+    <w:p>
+      <w:r>
+        <w:rPr>
+          <w:b/>
+        </w:rPr>
+        <w:t xml:space="preserve">19. </w:t>
       </w:r>
       <w:r>
         <w:rPr>
@@ -4660,7 +4845,81 @@
         <w:rPr>
           <w:b/>
         </w:rPr>
-        <w:t xml:space="preserve">15. </w:t>
+        <w:t xml:space="preserve">20. </w:t>
+      </w:r>
+      <w:r>
+        <w:rPr>
+          <w:b/>
+        </w:rPr>
+        <w:t>Lockheed Martin Integrates C2 with First Joint Fires Network Prototype (JFN at Valiant Shield 2024)</w:t>
+      </w:r>
+      <w:r>
+        <w:br/>
+        <w:t xml:space="preserve">   </w:t>
+      </w:r>
+      <w:hyperlink r:id="rId37">
+        <w:r>
+          <w:rPr>
+            <w:color w:val="0563C1"/>
+            <w:u w:val="single"/>
+          </w:rPr>
+          <w:t xml:space="preserve">https://news.lockheedmartin.com/2024-06-20-Lockheed-Martin-Integrates-Command-and-Control-Capabilities-with-First-Joint-Fires-Network-Prototype</w:t>
+        </w:r>
+      </w:hyperlink>
+    </w:p>
+    <w:p>
+      <w:r>
+        <w:rPr>
+          <w:i/>
+          <w:color w:val="555555"/>
+          <w:sz w:val="18"/>
+        </w:rPr>
+        <w:t xml:space="preserve">   Publisher: news-lockheedmartin-com   ·   Tier 4   ·   Captured: 2026-05-12   ·   Local: 01_sources/2026-05-12_news-lockheedmartin-com_lockheed-martin-integrates-c2-with-first-joint-fires-network.md</w:t>
+      </w:r>
+    </w:p>
+    <w:p>
+      <w:r>
+        <w:rPr>
+          <w:b/>
+        </w:rPr>
+        <w:t xml:space="preserve">21. </w:t>
+      </w:r>
+      <w:r>
+        <w:rPr>
+          <w:b/>
+        </w:rPr>
+        <w:t>Northrop Grumman Demonstrates Critical Capabilities in Indo-Pacific Region Exercises</w:t>
+      </w:r>
+      <w:r>
+        <w:br/>
+        <w:t xml:space="preserve">   </w:t>
+      </w:r>
+      <w:hyperlink r:id="rId38">
+        <w:r>
+          <w:rPr>
+            <w:color w:val="0563C1"/>
+            <w:u w:val="single"/>
+          </w:rPr>
+          <w:t xml:space="preserve">https://news.northropgrumman.com/global/northrop-grumman-demonstrates-critical-capabilities-in-indo-pacific-region-exercises</w:t>
+        </w:r>
+      </w:hyperlink>
+    </w:p>
+    <w:p>
+      <w:r>
+        <w:rPr>
+          <w:i/>
+          <w:color w:val="555555"/>
+          <w:sz w:val="18"/>
+        </w:rPr>
+        <w:t xml:space="preserve">   Publisher: news-northropgrumman-com   ·   Tier 4   ·   Captured: 2026-05-12   ·   Local: 01_sources/2026-05-12_news-northropgrumman-com_northrop-grumman-demonstrates-critical-capabilities-in-indo.md</w:t>
+      </w:r>
+    </w:p>
+    <w:p>
+      <w:r>
+        <w:rPr>
+          <w:b/>
+        </w:rPr>
+        <w:t xml:space="preserve">22. </w:t>
       </w:r>
       <w:r>
         <w:rPr>
@@ -4697,7 +4956,7 @@
         <w:rPr>
           <w:b/>
         </w:rPr>
-        <w:t xml:space="preserve">16. </w:t>
+        <w:t xml:space="preserve">23. </w:t>
       </w:r>
       <w:r>
         <w:rPr>
@@ -4734,7 +4993,81 @@
         <w:rPr>
           <w:b/>
         </w:rPr>
-        <w:t xml:space="preserve">17. </w:t>
+        <w:t xml:space="preserve">24. </w:t>
+      </w:r>
+      <w:r>
+        <w:rPr>
+          <w:b/>
+        </w:rPr>
+        <w:t>RTX Advanced Electronic Warfare prototype for F/A-18E/F Super Hornet passes critical review (Sep 2025)</w:t>
+      </w:r>
+      <w:r>
+        <w:br/>
+        <w:t xml:space="preserve">   </w:t>
+      </w:r>
+      <w:hyperlink r:id="rId39">
+        <w:r>
+          <w:rPr>
+            <w:color w:val="0563C1"/>
+            <w:u w:val="single"/>
+          </w:rPr>
+          <w:t xml:space="preserve">https://www.rtx.com/news/news-center/2025/09/22/rtxs-advanced-electronic-warfare-prototype-for-f-a-18e-f-super-hornet-passes-cri</w:t>
+        </w:r>
+      </w:hyperlink>
+    </w:p>
+    <w:p>
+      <w:r>
+        <w:rPr>
+          <w:i/>
+          <w:color w:val="555555"/>
+          <w:sz w:val="18"/>
+        </w:rPr>
+        <w:t xml:space="preserve">   Publisher: rtx-com   ·   Tier 4   ·   Captured: 2026-05-12   ·   Local: 01_sources/2026-05-12_rtx-com_rtx-advanced-electronic-warfare-prototype-for-f-a-18e-f-supe.md</w:t>
+      </w:r>
+    </w:p>
+    <w:p>
+      <w:r>
+        <w:rPr>
+          <w:b/>
+        </w:rPr>
+        <w:t xml:space="preserve">25. </w:t>
+      </w:r>
+      <w:r>
+        <w:rPr>
+          <w:b/>
+        </w:rPr>
+        <w:t>RTX Raytheon Delivers First Next Generation Jammer Shipsets to RAAF (April 2026)</w:t>
+      </w:r>
+      <w:r>
+        <w:br/>
+        <w:t xml:space="preserve">   </w:t>
+      </w:r>
+      <w:hyperlink r:id="rId40">
+        <w:r>
+          <w:rPr>
+            <w:color w:val="0563C1"/>
+            <w:u w:val="single"/>
+          </w:rPr>
+          <w:t xml:space="preserve">https://www.rtx.com/news/news-center/2026/04/20/rtxs-raytheon-delivers-first-next-generation-jammer-shipsets-to-the-royal-austra</w:t>
+        </w:r>
+      </w:hyperlink>
+    </w:p>
+    <w:p>
+      <w:r>
+        <w:rPr>
+          <w:i/>
+          <w:color w:val="555555"/>
+          <w:sz w:val="18"/>
+        </w:rPr>
+        <w:t xml:space="preserve">   Publisher: rtx-com   ·   Tier 4   ·   Captured: 2026-05-12   ·   Local: 01_sources/2026-05-12_rtx-com_rtx-raytheon-delivers-first-next-generation-jammer-shipsets.md</w:t>
+      </w:r>
+    </w:p>
+    <w:p>
+      <w:r>
+        <w:rPr>
+          <w:b/>
+        </w:rPr>
+        <w:t xml:space="preserve">26. </w:t>
       </w:r>
       <w:r>
         <w:rPr>
@@ -4771,7 +5104,7 @@
         <w:rPr>
           <w:b/>
         </w:rPr>
-        <w:t xml:space="preserve">18. </w:t>
+        <w:t xml:space="preserve">27. </w:t>
       </w:r>
       <w:r>
         <w:rPr>
@@ -4808,7 +5141,7 @@
         <w:rPr>
           <w:b/>
         </w:rPr>
-        <w:t xml:space="preserve">19. </w:t>
+        <w:t xml:space="preserve">28. </w:t>
       </w:r>
       <w:r>
         <w:rPr>
@@ -4845,7 +5178,7 @@
         <w:rPr>
           <w:b/>
         </w:rPr>
-        <w:t xml:space="preserve">20. </w:t>
+        <w:t xml:space="preserve">29. </w:t>
       </w:r>
       <w:r>
         <w:rPr>
@@ -4882,7 +5215,7 @@
         <w:rPr>
           <w:b/>
         </w:rPr>
-        <w:t xml:space="preserve">21. </w:t>
+        <w:t xml:space="preserve">30. </w:t>
       </w:r>
       <w:r>
         <w:rPr>
@@ -4919,7 +5252,118 @@
         <w:rPr>
           <w:b/>
         </w:rPr>
-        <w:t xml:space="preserve">22. </w:t>
+        <w:t xml:space="preserve">31. </w:t>
+      </w:r>
+      <w:r>
+        <w:rPr>
+          <w:b/>
+        </w:rPr>
+        <w:t>Huntington Ingalls Industries Form 10-K — Fiscal Year Ended December 31, 2025</w:t>
+      </w:r>
+      <w:r>
+        <w:br/>
+        <w:t xml:space="preserve">   </w:t>
+      </w:r>
+      <w:hyperlink r:id="rId41">
+        <w:r>
+          <w:rPr>
+            <w:color w:val="0563C1"/>
+            <w:u w:val="single"/>
+          </w:rPr>
+          <w:t xml:space="preserve">https://www.sec.gov/Archives/edgar/data/1501585/000150158526000006/hii-20251231.htm</w:t>
+        </w:r>
+      </w:hyperlink>
+    </w:p>
+    <w:p>
+      <w:r>
+        <w:rPr>
+          <w:i/>
+          <w:color w:val="555555"/>
+          <w:sz w:val="18"/>
+        </w:rPr>
+        <w:t xml:space="preserve">   Publisher: sec-gov   ·   Tier 2   ·   Captured: 2026-05-12   ·   Local: 01_sources/2026-05-12_sec-gov_huntington-ingalls-industries-form-10-k-fiscal-year-ended-de.md</w:t>
+      </w:r>
+    </w:p>
+    <w:p>
+      <w:r>
+        <w:rPr>
+          <w:b/>
+        </w:rPr>
+        <w:t xml:space="preserve">32. </w:t>
+      </w:r>
+      <w:r>
+        <w:rPr>
+          <w:b/>
+        </w:rPr>
+        <w:t>SOSi — INDOPACOM Mission Network (IMN) program page</w:t>
+      </w:r>
+      <w:r>
+        <w:br/>
+        <w:t xml:space="preserve">   </w:t>
+      </w:r>
+      <w:hyperlink r:id="rId42">
+        <w:r>
+          <w:rPr>
+            <w:color w:val="0563C1"/>
+            <w:u w:val="single"/>
+          </w:rPr>
+          <w:t xml:space="preserve">https://www.sosi.com/digital-infrastructure/cloud/indopacom-mission-partner-environment-mpe/</w:t>
+        </w:r>
+      </w:hyperlink>
+    </w:p>
+    <w:p>
+      <w:r>
+        <w:rPr>
+          <w:i/>
+          <w:color w:val="555555"/>
+          <w:sz w:val="18"/>
+        </w:rPr>
+        <w:t xml:space="preserve">   Publisher: sosi-com   ·   Tier 4   ·   Captured: 2026-05-12   ·   Local: 01_sources/2026-05-12_sosi-com_sosi-indopacom-mission-network-imn-program-page.md</w:t>
+      </w:r>
+    </w:p>
+    <w:p>
+      <w:r>
+        <w:rPr>
+          <w:b/>
+        </w:rPr>
+        <w:t xml:space="preserve">33. </w:t>
+      </w:r>
+      <w:r>
+        <w:rPr>
+          <w:b/>
+        </w:rPr>
+        <w:t>Japan Teams With Northrop Grumman to Boost Electronic Warfare Capabilities (April 2026)</w:t>
+      </w:r>
+      <w:r>
+        <w:br/>
+        <w:t xml:space="preserve">   </w:t>
+      </w:r>
+      <w:hyperlink r:id="rId43">
+        <w:r>
+          <w:rPr>
+            <w:color w:val="0563C1"/>
+            <w:u w:val="single"/>
+          </w:rPr>
+          <w:t xml:space="preserve">https://thedefensepost.com/2026/04/28/japan-northrop-grumman-electronic-warfare/</w:t>
+        </w:r>
+      </w:hyperlink>
+    </w:p>
+    <w:p>
+      <w:r>
+        <w:rPr>
+          <w:i/>
+          <w:color w:val="555555"/>
+          <w:sz w:val="18"/>
+        </w:rPr>
+        <w:t xml:space="preserve">   Publisher: thedefensepost-com   ·   Tier 4   ·   Captured: 2026-05-12   ·   Pub: 2026-04-28   ·   Local: 01_sources/2026-05-12_thedefensepost-com_japan-teams-with-northrop-grumman-to-boost-electronic-warfar.md</w:t>
+      </w:r>
+    </w:p>
+    <w:p>
+      <w:r>
+        <w:rPr>
+          <w:b/>
+        </w:rPr>
+        <w:t xml:space="preserve">34. </w:t>
       </w:r>
       <w:r>
         <w:rPr>

</xml_diff>